<commit_message>
Jelszavak: hozzaadtam a VPN-t
</commit_message>
<xml_diff>
--- a/jelszavak.docx
+++ b/jelszavak.docx
@@ -202,13 +202,7 @@
       </w:r>
       <w:proofErr w:type="spellEnd"/>
       <w:r>
-        <w:t xml:space="preserve">: </w:t>
-      </w:r>
-      <w:r>
-        <w:t>Malac</w:t>
-      </w:r>
-      <w:r>
-        <w:t>123#</w:t>
+        <w:t>: Malac123#</w:t>
       </w:r>
     </w:p>
     <w:p>
@@ -224,13 +218,7 @@
         </w:rPr>
       </w:pPr>
       <w:r>
-        <w:t xml:space="preserve">konzol: </w:t>
-      </w:r>
-      <w:r>
-        <w:t>Vereb</w:t>
-      </w:r>
-      <w:r>
-        <w:t>456!</w:t>
+        <w:t>konzol: Vereb456!</w:t>
       </w:r>
     </w:p>
     <w:p>
@@ -246,13 +234,7 @@
         </w:rPr>
       </w:pPr>
       <w:r>
-        <w:t xml:space="preserve">távoli elérés: </w:t>
-      </w:r>
-      <w:r>
-        <w:t>Kenguru</w:t>
-      </w:r>
-      <w:r>
-        <w:t>789$</w:t>
+        <w:t>távoli elérés: Kenguru789$</w:t>
       </w:r>
     </w:p>
     <w:p>
@@ -372,13 +354,7 @@
       </w:r>
       <w:proofErr w:type="spellEnd"/>
       <w:r>
-        <w:t xml:space="preserve">: </w:t>
-      </w:r>
-      <w:r>
-        <w:t>Zene</w:t>
-      </w:r>
-      <w:r>
-        <w:t>123#</w:t>
+        <w:t>: Zene123#</w:t>
       </w:r>
     </w:p>
     <w:p>
@@ -394,13 +370,7 @@
         </w:rPr>
       </w:pPr>
       <w:r>
-        <w:t xml:space="preserve">konzol: </w:t>
-      </w:r>
-      <w:r>
-        <w:t>Tanc</w:t>
-      </w:r>
-      <w:r>
-        <w:t>456!</w:t>
+        <w:t>konzol: Tanc456!</w:t>
       </w:r>
     </w:p>
     <w:p>
@@ -416,13 +386,7 @@
         </w:rPr>
       </w:pPr>
       <w:r>
-        <w:t xml:space="preserve">távoli elérés: </w:t>
-      </w:r>
-      <w:r>
-        <w:t>Ritmus</w:t>
-      </w:r>
-      <w:r>
-        <w:t>789$</w:t>
+        <w:t>távoli elérés: Ritmus789$</w:t>
       </w:r>
     </w:p>
     <w:p>
@@ -472,13 +436,7 @@
       </w:r>
       <w:proofErr w:type="spellEnd"/>
       <w:r>
-        <w:t xml:space="preserve">: </w:t>
-      </w:r>
-      <w:r>
-        <w:t>Csodas</w:t>
-      </w:r>
-      <w:r>
-        <w:t>123#</w:t>
+        <w:t>: Csodas123#</w:t>
       </w:r>
     </w:p>
     <w:p>
@@ -494,13 +452,7 @@
         </w:rPr>
       </w:pPr>
       <w:r>
-        <w:t xml:space="preserve">konzol: </w:t>
-      </w:r>
-      <w:r>
-        <w:t>Ez</w:t>
-      </w:r>
-      <w:r>
-        <w:t>456!</w:t>
+        <w:t>konzol: Ez456!</w:t>
       </w:r>
     </w:p>
     <w:p>
@@ -518,13 +470,65 @@
         </w:rPr>
       </w:pPr>
       <w:r>
-        <w:t xml:space="preserve">távoli elérés: </w:t>
-      </w:r>
-      <w:r>
-        <w:t>aNap</w:t>
-      </w:r>
-      <w:r>
-        <w:t>789$</w:t>
+        <w:t>távoli elérés: aNap789$</w:t>
+      </w:r>
+    </w:p>
+    <w:p>
+      <w:pPr>
+        <w:pStyle w:val="Listaszerbekezds"/>
+        <w:numPr>
+          <w:ilvl w:val="0"/>
+          <w:numId w:val="2"/>
+        </w:numPr>
+        <w:spacing w:after="480"/>
+        <w:rPr>
+          <w:b/>
+          <w:bCs/>
+        </w:rPr>
+      </w:pPr>
+      <w:r>
+        <w:rPr>
+          <w:b/>
+          <w:bCs/>
+        </w:rPr>
+        <w:t xml:space="preserve">Site </w:t>
+      </w:r>
+      <w:proofErr w:type="spellStart"/>
+      <w:r>
+        <w:rPr>
+          <w:b/>
+          <w:bCs/>
+        </w:rPr>
+        <w:t>to</w:t>
+      </w:r>
+      <w:proofErr w:type="spellEnd"/>
+      <w:r>
+        <w:rPr>
+          <w:b/>
+          <w:bCs/>
+        </w:rPr>
+        <w:t xml:space="preserve"> Site VPN</w:t>
+      </w:r>
+      <w:r>
+        <w:t>:</w:t>
+      </w:r>
+    </w:p>
+    <w:p>
+      <w:pPr>
+        <w:pStyle w:val="Listaszerbekezds"/>
+        <w:numPr>
+          <w:ilvl w:val="1"/>
+          <w:numId w:val="2"/>
+        </w:numPr>
+        <w:spacing w:after="480"/>
+      </w:pPr>
+      <w:proofErr w:type="spellStart"/>
+      <w:r>
+        <w:t>jelszo</w:t>
+      </w:r>
+      <w:proofErr w:type="spellEnd"/>
+      <w:r>
+        <w:t>: titkos123</w:t>
       </w:r>
     </w:p>
     <w:p>
@@ -547,16 +551,107 @@
           <w:szCs w:val="32"/>
           <w:u w:val="single"/>
         </w:rPr>
-        <w:t>AK-telephely</w:t>
-      </w:r>
-      <w:r>
-        <w:rPr>
-          <w:rFonts w:ascii="Bookman Old Style" w:hAnsi="Bookman Old Style"/>
-          <w:b/>
-          <w:bCs/>
-          <w:sz w:val="32"/>
-          <w:szCs w:val="32"/>
-          <w:u w:val="single"/>
+        <w:t>AK-telephely:</w:t>
+      </w:r>
+    </w:p>
+    <w:p>
+      <w:pPr>
+        <w:pStyle w:val="Listaszerbekezds"/>
+        <w:numPr>
+          <w:ilvl w:val="0"/>
+          <w:numId w:val="2"/>
+        </w:numPr>
+        <w:rPr>
+          <w:b/>
+          <w:bCs/>
+        </w:rPr>
+      </w:pPr>
+      <w:r>
+        <w:rPr>
+          <w:b/>
+          <w:bCs/>
+        </w:rPr>
+        <w:t>Routerek:</w:t>
+      </w:r>
+    </w:p>
+    <w:p>
+      <w:pPr>
+        <w:pStyle w:val="Listaszerbekezds"/>
+        <w:numPr>
+          <w:ilvl w:val="1"/>
+          <w:numId w:val="2"/>
+        </w:numPr>
+        <w:rPr>
+          <w:b/>
+          <w:bCs/>
+        </w:rPr>
+      </w:pPr>
+      <w:proofErr w:type="spellStart"/>
+      <w:r>
+        <w:t>en</w:t>
+      </w:r>
+      <w:proofErr w:type="spellEnd"/>
+      <w:r>
+        <w:t>: Lagzi123#</w:t>
+      </w:r>
+    </w:p>
+    <w:p>
+      <w:pPr>
+        <w:pStyle w:val="Listaszerbekezds"/>
+        <w:numPr>
+          <w:ilvl w:val="1"/>
+          <w:numId w:val="2"/>
+        </w:numPr>
+        <w:rPr>
+          <w:b/>
+          <w:bCs/>
+        </w:rPr>
+      </w:pPr>
+      <w:r>
+        <w:t>konzol: Lajos456!</w:t>
+      </w:r>
+    </w:p>
+    <w:p>
+      <w:pPr>
+        <w:pStyle w:val="Listaszerbekezds"/>
+        <w:numPr>
+          <w:ilvl w:val="1"/>
+          <w:numId w:val="2"/>
+        </w:numPr>
+        <w:rPr>
+          <w:b/>
+          <w:bCs/>
+        </w:rPr>
+      </w:pPr>
+      <w:r>
+        <w:t>távoli elérés: Enekel789$</w:t>
+      </w:r>
+    </w:p>
+    <w:p>
+      <w:pPr>
+        <w:pStyle w:val="Listaszerbekezds"/>
+        <w:numPr>
+          <w:ilvl w:val="0"/>
+          <w:numId w:val="2"/>
+        </w:numPr>
+        <w:rPr>
+          <w:b/>
+          <w:bCs/>
+        </w:rPr>
+      </w:pPr>
+      <w:proofErr w:type="spellStart"/>
+      <w:r>
+        <w:rPr>
+          <w:b/>
+          <w:bCs/>
+        </w:rPr>
+        <w:t>Switchek</w:t>
+      </w:r>
+      <w:proofErr w:type="spellEnd"/>
+      <w:r>
+        <w:rPr>
+          <w:b/>
+          <w:bCs/>
         </w:rPr>
         <w:t>:</w:t>
       </w:r>
@@ -565,26 +660,6 @@
       <w:pPr>
         <w:pStyle w:val="Listaszerbekezds"/>
         <w:numPr>
-          <w:ilvl w:val="0"/>
-          <w:numId w:val="2"/>
-        </w:numPr>
-        <w:rPr>
-          <w:b/>
-          <w:bCs/>
-        </w:rPr>
-      </w:pPr>
-      <w:r>
-        <w:rPr>
-          <w:b/>
-          <w:bCs/>
-        </w:rPr>
-        <w:t>Routerek:</w:t>
-      </w:r>
-    </w:p>
-    <w:p>
-      <w:pPr>
-        <w:pStyle w:val="Listaszerbekezds"/>
-        <w:numPr>
           <w:ilvl w:val="1"/>
           <w:numId w:val="2"/>
         </w:numPr>
@@ -599,13 +674,7 @@
       </w:r>
       <w:proofErr w:type="spellEnd"/>
       <w:r>
-        <w:t xml:space="preserve">: </w:t>
-      </w:r>
-      <w:r>
-        <w:t>Lagzi</w:t>
-      </w:r>
-      <w:r>
-        <w:t>123#</w:t>
+        <w:t>: Nagyon123#</w:t>
       </w:r>
     </w:p>
     <w:p>
@@ -621,13 +690,7 @@
         </w:rPr>
       </w:pPr>
       <w:r>
-        <w:t xml:space="preserve">konzol: </w:t>
-      </w:r>
-      <w:r>
-        <w:t>Lajos</w:t>
-      </w:r>
-      <w:r>
-        <w:t>456!</w:t>
+        <w:t>konzol: Szeretem456!</w:t>
       </w:r>
     </w:p>
     <w:p>
@@ -643,113 +706,7 @@
         </w:rPr>
       </w:pPr>
       <w:r>
-        <w:t xml:space="preserve">távoli elérés: </w:t>
-      </w:r>
-      <w:r>
-        <w:t>Enekel</w:t>
-      </w:r>
-      <w:r>
-        <w:t>789$</w:t>
-      </w:r>
-    </w:p>
-    <w:p>
-      <w:pPr>
-        <w:pStyle w:val="Listaszerbekezds"/>
-        <w:numPr>
-          <w:ilvl w:val="0"/>
-          <w:numId w:val="2"/>
-        </w:numPr>
-        <w:rPr>
-          <w:b/>
-          <w:bCs/>
-        </w:rPr>
-      </w:pPr>
-      <w:proofErr w:type="spellStart"/>
-      <w:r>
-        <w:rPr>
-          <w:b/>
-          <w:bCs/>
-        </w:rPr>
-        <w:t>Switchek</w:t>
-      </w:r>
-      <w:proofErr w:type="spellEnd"/>
-      <w:r>
-        <w:rPr>
-          <w:b/>
-          <w:bCs/>
-        </w:rPr>
-        <w:t>:</w:t>
-      </w:r>
-    </w:p>
-    <w:p>
-      <w:pPr>
-        <w:pStyle w:val="Listaszerbekezds"/>
-        <w:numPr>
-          <w:ilvl w:val="1"/>
-          <w:numId w:val="2"/>
-        </w:numPr>
-        <w:rPr>
-          <w:b/>
-          <w:bCs/>
-        </w:rPr>
-      </w:pPr>
-      <w:proofErr w:type="spellStart"/>
-      <w:r>
-        <w:t>en</w:t>
-      </w:r>
-      <w:proofErr w:type="spellEnd"/>
-      <w:r>
-        <w:t xml:space="preserve">: </w:t>
-      </w:r>
-      <w:r>
-        <w:t>Nagyon</w:t>
-      </w:r>
-      <w:r>
-        <w:t>123#</w:t>
-      </w:r>
-    </w:p>
-    <w:p>
-      <w:pPr>
-        <w:pStyle w:val="Listaszerbekezds"/>
-        <w:numPr>
-          <w:ilvl w:val="1"/>
-          <w:numId w:val="2"/>
-        </w:numPr>
-        <w:rPr>
-          <w:b/>
-          <w:bCs/>
-        </w:rPr>
-      </w:pPr>
-      <w:r>
-        <w:t xml:space="preserve">konzol: </w:t>
-      </w:r>
-      <w:r>
-        <w:t>Szeretem</w:t>
-      </w:r>
-      <w:r>
-        <w:t>456!</w:t>
-      </w:r>
-    </w:p>
-    <w:p>
-      <w:pPr>
-        <w:pStyle w:val="Listaszerbekezds"/>
-        <w:numPr>
-          <w:ilvl w:val="1"/>
-          <w:numId w:val="2"/>
-        </w:numPr>
-        <w:rPr>
-          <w:b/>
-          <w:bCs/>
-        </w:rPr>
-      </w:pPr>
-      <w:r>
-        <w:t xml:space="preserve">távoli elérés: </w:t>
-      </w:r>
-      <w:r>
-        <w:t>azOszt</w:t>
-      </w:r>
-      <w:r>
-        <w:t>789$</w:t>
+        <w:t>távoli elérés: azOszt789$</w:t>
       </w:r>
     </w:p>
     <w:p>

</xml_diff>